<commit_message>
changes to project proposal
</commit_message>
<xml_diff>
--- a/Tentative Project Proposal.docx
+++ b/Tentative Project Proposal.docx
@@ -14,8 +14,16 @@
           <w:b/>
           <w:bCs/>
         </w:rPr>
-        <w:t>Are Traditional Financial Indicators Truly Predictive of Default Risk? A Regression-Based Analysis of Credit Behavior</w:t>
-      </w:r>
+        <w:t>Coefficient Stability and Interpretation in Credit Default Models with Correlated Predictors</w:t>
+      </w:r>
+    </w:p>
+    <w:p>
+      <w:pPr>
+        <w:rPr>
+          <w:b/>
+          <w:bCs/>
+        </w:rPr>
+      </w:pPr>
     </w:p>
     <w:p>
       <w:pPr>
@@ -34,50 +42,56 @@
     </w:p>
     <w:p>
       <w:r>
-        <w:t>A common assumption in credit risk modeling is that individuals with higher income or larger credit limits are less likely to default. These variables are often used as primary indicators of creditworthiness in both industry practice and simplified predictive models. However, this relationship may be misleading if such financial indicators are correlated with more fundamental behavioral factors, such as repayment history and credit usage patterns.</w:t>
-      </w:r>
-    </w:p>
-    <w:p>
-      <w:r>
-        <w:t>This motivates the central research question of this project:</w:t>
-      </w:r>
-      <w:r>
-        <w:br/>
-      </w:r>
-      <w:r>
+        <w:t xml:space="preserve">Credit risk models often include multiple variables that are </w:t>
+      </w:r>
+      <w:proofErr w:type="gramStart"/>
+      <w:r>
+        <w:t>closely related to one another</w:t>
+      </w:r>
+      <w:proofErr w:type="gramEnd"/>
+      <w:r>
+        <w:t>. In the context of credit card data, financial variables such as credit limits, account balances, and payment amounts are used alongside behavioral variables such as repayment history. While these variables are all intended to capture borrower risk, they are not independent signals. Instead, they often reflect overlapping aspects of the same underlying process.</w:t>
+      </w:r>
+    </w:p>
+    <w:p>
+      <w:r>
+        <w:t>This creates a challenge for regression analysis. When predictors are highly correlated, it becomes difficult to interpret individual coefficients. A variable may appear important in one model but lose significance when additional correlated variables are included. This raises a natural question: can we meaningfully interpret the effect of individual variables when they encode similar information?</w:t>
+      </w:r>
+    </w:p>
+    <w:p>
+      <w:pPr>
         <w:rPr>
           <w:b/>
           <w:bCs/>
         </w:rPr>
-        <w:t>Are commonly used indicators like income and credit limit truly predictive of default risk, or are they proxies for underlying repayment behavior?</w:t>
-      </w:r>
-    </w:p>
-    <w:p>
-      <w:r>
-        <w:t>This question is important because different answers lead to different decision-making strategies. If income and credit limits are truly causal drivers of default risk, then credit allocation policies should prioritize these variables. However, if their apparent predictive power disappears after controlling for repayment behavior, then relying on them may lead to suboptimal or biased decisions. More broadly, this project examines how regression-based conclusions about default risk can change when accounting for confounding variables, model specification, and functional form.</w:t>
-      </w:r>
-    </w:p>
-    <w:p>
-      <w:r>
-        <w:t xml:space="preserve">The goal of this project is therefore not only to identify key predictors of default, but also to evaluate the </w:t>
-      </w:r>
-      <w:r>
+      </w:pPr>
+      <w:r>
+        <w:t xml:space="preserve">This project examines how regression-based conclusions about credit default change as model specification evolves. </w:t>
+      </w:r>
+      <w:proofErr w:type="gramStart"/>
+      <w:r>
+        <w:t>In particular, it</w:t>
+      </w:r>
+      <w:proofErr w:type="gramEnd"/>
+      <w:r>
+        <w:t xml:space="preserve"> focuses on how the apparent importance of financial variables changes after </w:t>
+      </w:r>
+      <w:proofErr w:type="gramStart"/>
+      <w:r>
+        <w:t>controlling for</w:t>
+      </w:r>
+      <w:proofErr w:type="gramEnd"/>
+      <w:r>
+        <w:t xml:space="preserve"> repayment behavior, and whether these conclusions remain stable across different modeling approaches. The goal is not to build the most accurate predictive model, but to understand how reliable coefficient-level interpretation is in the presence of correlated predictors.</w:t>
+      </w:r>
+    </w:p>
+    <w:p>
+      <w:pPr>
         <w:rPr>
           <w:b/>
           <w:bCs/>
         </w:rPr>
-        <w:t>robustness and interpretability of those predictors</w:t>
-      </w:r>
-      <w:r>
-        <w:t xml:space="preserve"> under different regression frameworks, consistent with the course emphasis on careful model specification, diagnostics, and interpretation. </w:t>
-      </w:r>
-    </w:p>
-    <w:p>
-      <w:r>
-        <w:pict w14:anchorId="2228E5B3">
-          <v:rect id="_x0000_i1073" style="width:0;height:1.5pt" o:hralign="center" o:hrstd="t" o:hr="t" fillcolor="#a0a0a0" stroked="f"/>
-        </w:pict>
-      </w:r>
+      </w:pPr>
     </w:p>
     <w:p>
       <w:pPr>
@@ -91,117 +105,178 @@
           <w:b/>
           <w:bCs/>
         </w:rPr>
-        <w:t>2. Data and Domain Problem</w:t>
-      </w:r>
-    </w:p>
-    <w:p>
-      <w:r>
-        <w:t xml:space="preserve">This project will use the </w:t>
-      </w:r>
-      <w:r>
+        <w:t>2. Data</w:t>
+      </w:r>
+    </w:p>
+    <w:p>
+      <w:r>
+        <w:t>The analysis uses the UCI Default of Credit Card Clients Dataset, which contains 30,000 observations of credit card clients in Taiwan.</w:t>
+      </w:r>
+    </w:p>
+    <w:p>
+      <w:r>
+        <w:t>The dataset includes:</w:t>
+      </w:r>
+    </w:p>
+    <w:p>
+      <w:pPr>
+        <w:numPr>
+          <w:ilvl w:val="0"/>
+          <w:numId w:val="10"/>
+        </w:numPr>
+      </w:pPr>
+      <w:r>
+        <w:t xml:space="preserve">A binary outcome indicating whether a client defaults in the following month </w:t>
+      </w:r>
+    </w:p>
+    <w:p>
+      <w:pPr>
+        <w:numPr>
+          <w:ilvl w:val="0"/>
+          <w:numId w:val="10"/>
+        </w:numPr>
+      </w:pPr>
+      <w:r>
+        <w:t xml:space="preserve">Financial variables such as credit limit, bill amounts, and payment amounts </w:t>
+      </w:r>
+    </w:p>
+    <w:p>
+      <w:pPr>
+        <w:numPr>
+          <w:ilvl w:val="0"/>
+          <w:numId w:val="10"/>
+        </w:numPr>
+      </w:pPr>
+      <w:r>
+        <w:t xml:space="preserve">Behavioral variables capturing repayment status over the past six months </w:t>
+      </w:r>
+    </w:p>
+    <w:p>
+      <w:pPr>
+        <w:numPr>
+          <w:ilvl w:val="0"/>
+          <w:numId w:val="10"/>
+        </w:numPr>
+      </w:pPr>
+      <w:r>
+        <w:t xml:space="preserve">Demographic variables including age, education, marital status, and sex </w:t>
+      </w:r>
+    </w:p>
+    <w:p>
+      <w:r>
+        <w:lastRenderedPageBreak/>
+        <w:t xml:space="preserve">Some minor preprocessing is required. </w:t>
+      </w:r>
+      <w:r>
+        <w:t>A</w:t>
+      </w:r>
+      <w:r>
+        <w:t xml:space="preserve"> small number of undocumented category values (e.g., in education and marital status) are grouped into </w:t>
+      </w:r>
+      <w:proofErr w:type="gramStart"/>
+      <w:r>
+        <w:t>an “other”</w:t>
+      </w:r>
+      <w:proofErr w:type="gramEnd"/>
+      <w:r>
+        <w:t xml:space="preserve"> category to avoid introducing arbitrary interpretations. Repayment status variables include values that are not fully defined in the documentation; these are retained and treated conservatively as indicators of non-delay, rather than assigning additional meaning.</w:t>
+      </w:r>
+    </w:p>
+    <w:p>
+      <w:pPr>
         <w:rPr>
           <w:b/>
           <w:bCs/>
         </w:rPr>
-        <w:t>UCI Default of Credit Card Clients Dataset</w:t>
-      </w:r>
-      <w:r>
-        <w:t>, which contains real-world financial data on credit card clients.</w:t>
-      </w:r>
-    </w:p>
-    <w:p>
-      <w:r>
-        <w:t>The dataset includes:</w:t>
-      </w:r>
-    </w:p>
-    <w:p>
-      <w:pPr>
-        <w:numPr>
-          <w:ilvl w:val="0"/>
-          <w:numId w:val="1"/>
-        </w:numPr>
-      </w:pPr>
-      <w:r>
+      </w:pPr>
+    </w:p>
+    <w:p>
+      <w:pPr>
         <w:rPr>
           <w:b/>
           <w:bCs/>
         </w:rPr>
-        <w:t>Outcome variable</w:t>
-      </w:r>
-      <w:r>
-        <w:t xml:space="preserve">: default status (binary indicator) </w:t>
-      </w:r>
-    </w:p>
-    <w:p>
-      <w:pPr>
-        <w:numPr>
-          <w:ilvl w:val="0"/>
-          <w:numId w:val="1"/>
-        </w:numPr>
       </w:pPr>
       <w:r>
         <w:rPr>
           <w:b/>
           <w:bCs/>
         </w:rPr>
-        <w:t>Financial variables</w:t>
-      </w:r>
-      <w:r>
-        <w:t xml:space="preserve">: credit limit, bill amounts, payment amounts </w:t>
-      </w:r>
-    </w:p>
-    <w:p>
-      <w:pPr>
-        <w:numPr>
-          <w:ilvl w:val="0"/>
-          <w:numId w:val="1"/>
-        </w:numPr>
-      </w:pPr>
-      <w:r>
+        <w:t>3. Methodology</w:t>
+      </w:r>
+    </w:p>
+    <w:p>
+      <w:r>
+        <w:t>The analysis is structured to show how regression results change as additional variables and modeling choices are introduced.</w:t>
+      </w:r>
+    </w:p>
+    <w:p>
+      <w:pPr>
         <w:rPr>
           <w:b/>
           <w:bCs/>
         </w:rPr>
-        <w:t>Behavioral variables</w:t>
-      </w:r>
-      <w:r>
-        <w:t xml:space="preserve">: repayment history (e.g., past payment delays) </w:t>
-      </w:r>
-    </w:p>
-    <w:p>
-      <w:pPr>
-        <w:numPr>
-          <w:ilvl w:val="0"/>
-          <w:numId w:val="1"/>
-        </w:numPr>
       </w:pPr>
       <w:r>
         <w:rPr>
           <w:b/>
           <w:bCs/>
         </w:rPr>
-        <w:t>Demographic variables</w:t>
-      </w:r>
-      <w:r>
-        <w:t xml:space="preserve">: age, education, marital status </w:t>
-      </w:r>
-    </w:p>
-    <w:p>
-      <w:r>
-        <w:lastRenderedPageBreak/>
-        <w:t xml:space="preserve">The dataset contains over 30,000 observations and multiple predictors, satisfying the requirement for a sufficiently large and rich dataset. </w:t>
-      </w:r>
-    </w:p>
-    <w:p>
-      <w:r>
-        <w:t>The domain problem is grounded in credit risk assessment. Financial institutions must determine which factors truly signal default risk. If income or credit limits are merely proxies for repayment behavior, then models that rely heavily on these variables may mischaracterize risk. A regression-based analysis allows us to disentangle these relationships and assess which variables remain significant after controlling for others.</w:t>
-      </w:r>
-    </w:p>
-    <w:p>
-      <w:r>
-        <w:pict w14:anchorId="1600C25F">
-          <v:rect id="_x0000_i1074" style="width:0;height:1.5pt" o:hralign="center" o:hrstd="t" o:hr="t" fillcolor="#a0a0a0" stroked="f"/>
-        </w:pict>
+        <w:t>3.1 Exploratory Analysis</w:t>
+      </w:r>
+    </w:p>
+    <w:p>
+      <w:r>
+        <w:t>The first step is to examine basic patterns in the data, including:</w:t>
+      </w:r>
+    </w:p>
+    <w:p>
+      <w:pPr>
+        <w:numPr>
+          <w:ilvl w:val="0"/>
+          <w:numId w:val="11"/>
+        </w:numPr>
+      </w:pPr>
+      <w:r>
+        <w:t xml:space="preserve">overall default rates </w:t>
+      </w:r>
+    </w:p>
+    <w:p>
+      <w:pPr>
+        <w:numPr>
+          <w:ilvl w:val="0"/>
+          <w:numId w:val="11"/>
+        </w:numPr>
+      </w:pPr>
+      <w:r>
+        <w:t xml:space="preserve">default rates across repayment status levels </w:t>
+      </w:r>
+    </w:p>
+    <w:p>
+      <w:pPr>
+        <w:numPr>
+          <w:ilvl w:val="0"/>
+          <w:numId w:val="11"/>
+        </w:numPr>
+      </w:pPr>
+      <w:r>
+        <w:t xml:space="preserve">default rates across credit limit levels </w:t>
+      </w:r>
+    </w:p>
+    <w:p>
+      <w:pPr>
+        <w:numPr>
+          <w:ilvl w:val="0"/>
+          <w:numId w:val="11"/>
+        </w:numPr>
+      </w:pPr>
+      <w:r>
+        <w:t xml:space="preserve">correlations among financial and behavioral variables </w:t>
+      </w:r>
+    </w:p>
+    <w:p>
+      <w:r>
+        <w:t>This helps identify whether financial variables appear predictive on their own and how strongly they are related to repayment behavior.</w:t>
       </w:r>
     </w:p>
     <w:p>
@@ -211,101 +286,72 @@
           <w:bCs/>
         </w:rPr>
       </w:pPr>
-      <w:r>
+    </w:p>
+    <w:p>
+      <w:pPr>
         <w:rPr>
           <w:b/>
           <w:bCs/>
         </w:rPr>
-        <w:t>3. Regression Analysis Plan</w:t>
-      </w:r>
-    </w:p>
-    <w:p>
-      <w:r>
-        <w:t>The analysis will proceed in stages, beginning with simple models and progressively incorporating more appropriate specifications and diagnostics.</w:t>
-      </w:r>
-    </w:p>
-    <w:p>
-      <w:r>
-        <w:pict w14:anchorId="362D6EC9">
-          <v:rect id="_x0000_i1075" style="width:0;height:1.5pt" o:hralign="center" o:hrstd="t" o:hr="t" fillcolor="#a0a0a0" stroked="f"/>
-        </w:pict>
-      </w:r>
-    </w:p>
-    <w:p>
-      <w:pPr>
+      </w:pPr>
+      <w:r>
         <w:rPr>
           <w:b/>
           <w:bCs/>
         </w:rPr>
-      </w:pPr>
-      <w:r>
+        <w:t>3.2 Baseline Models</w:t>
+      </w:r>
+    </w:p>
+    <w:p>
+      <w:r>
+        <w:t>The analysis begins with simple regression models using subsets of variables:</w:t>
+      </w:r>
+    </w:p>
+    <w:p>
+      <w:pPr>
+        <w:numPr>
+          <w:ilvl w:val="0"/>
+          <w:numId w:val="12"/>
+        </w:numPr>
+      </w:pPr>
+      <w:r>
+        <w:t xml:space="preserve">financial variables only </w:t>
+      </w:r>
+    </w:p>
+    <w:p>
+      <w:pPr>
+        <w:numPr>
+          <w:ilvl w:val="0"/>
+          <w:numId w:val="12"/>
+        </w:numPr>
+      </w:pPr>
+      <w:r>
+        <w:t xml:space="preserve">behavioral variables only </w:t>
+      </w:r>
+    </w:p>
+    <w:p>
+      <w:pPr>
+        <w:numPr>
+          <w:ilvl w:val="0"/>
+          <w:numId w:val="12"/>
+        </w:numPr>
+      </w:pPr>
+      <w:r>
+        <w:t xml:space="preserve">combined models </w:t>
+      </w:r>
+    </w:p>
+    <w:p>
+      <w:r>
+        <w:t>Linear probability models (OLS) are used initially because they make it easy to interpret coefficients and observe how they change when additional variables are included.</w:t>
+      </w:r>
+    </w:p>
+    <w:p>
+      <w:pPr>
         <w:rPr>
           <w:b/>
           <w:bCs/>
         </w:rPr>
-        <w:t>Exploratory Data Analysis</w:t>
-      </w:r>
-    </w:p>
-    <w:p>
-      <w:r>
-        <w:t>Initial analysis will examine:</w:t>
-      </w:r>
-    </w:p>
-    <w:p>
-      <w:pPr>
-        <w:numPr>
-          <w:ilvl w:val="0"/>
-          <w:numId w:val="2"/>
-        </w:numPr>
-      </w:pPr>
-      <w:r>
-        <w:t xml:space="preserve">overall default rates </w:t>
-      </w:r>
-    </w:p>
-    <w:p>
-      <w:pPr>
-        <w:numPr>
-          <w:ilvl w:val="0"/>
-          <w:numId w:val="2"/>
-        </w:numPr>
-      </w:pPr>
-      <w:r>
-        <w:t xml:space="preserve">default rates across credit limit levels </w:t>
-      </w:r>
-    </w:p>
-    <w:p>
-      <w:pPr>
-        <w:numPr>
-          <w:ilvl w:val="0"/>
-          <w:numId w:val="2"/>
-        </w:numPr>
-      </w:pPr>
-      <w:r>
-        <w:t xml:space="preserve">relationships between repayment history and default </w:t>
-      </w:r>
-    </w:p>
-    <w:p>
-      <w:pPr>
-        <w:numPr>
-          <w:ilvl w:val="0"/>
-          <w:numId w:val="2"/>
-        </w:numPr>
-      </w:pPr>
-      <w:r>
-        <w:t xml:space="preserve">correlations among financial and behavioral variables </w:t>
-      </w:r>
-    </w:p>
-    <w:p>
-      <w:r>
-        <w:t>This step will help identify potential confounding relationships and guide model specification.</w:t>
-      </w:r>
-    </w:p>
-    <w:p>
-      <w:r>
-        <w:pict w14:anchorId="07FFD84F">
-          <v:rect id="_x0000_i1076" style="width:0;height:1.5pt" o:hralign="center" o:hrstd="t" o:hr="t" fillcolor="#a0a0a0" stroked="f"/>
-        </w:pict>
-      </w:r>
+      </w:pPr>
     </w:p>
     <w:p>
       <w:pPr>
@@ -319,131 +365,27 @@
           <w:b/>
           <w:bCs/>
         </w:rPr>
-        <w:t>Linear Probability Model (LPM)</w:t>
-      </w:r>
-    </w:p>
-    <w:p>
-      <w:r>
-        <w:t xml:space="preserve">As a baseline, I will estimate a </w:t>
-      </w:r>
-      <w:r>
+        <w:t>3.3 Omitted Variable Bias and Specification Changes</w:t>
+      </w:r>
+    </w:p>
+    <w:p>
+      <w:r>
+        <w:lastRenderedPageBreak/>
+        <w:t>A key part of the project is comparing nested models to see how coefficients evolve. In particular, the analysis focuses on whether financial variables lose explanatory power after adding repayment behavior.</w:t>
+      </w:r>
+    </w:p>
+    <w:p>
+      <w:r>
+        <w:t>These comparisons provide a direct illustration of omitted variable bias and help determine whether financial variables are capturing independent effects or acting as proxies for behavioral variables.</w:t>
+      </w:r>
+    </w:p>
+    <w:p>
+      <w:pPr>
         <w:rPr>
           <w:b/>
           <w:bCs/>
         </w:rPr>
-        <w:t>linear probability model (LPM)</w:t>
-      </w:r>
-      <w:r>
-        <w:t xml:space="preserve"> using OLS, where default status is regressed on financial indicators such as credit limit and income-related variables.</w:t>
-      </w:r>
-    </w:p>
-    <w:p>
-      <w:r>
-        <w:t>This model provides:</w:t>
-      </w:r>
-    </w:p>
-    <w:p>
-      <w:pPr>
-        <w:numPr>
-          <w:ilvl w:val="0"/>
-          <w:numId w:val="3"/>
-        </w:numPr>
-      </w:pPr>
-      <w:r>
-        <w:t xml:space="preserve">direct interpretation of coefficients as changes in probability </w:t>
-      </w:r>
-    </w:p>
-    <w:p>
-      <w:pPr>
-        <w:numPr>
-          <w:ilvl w:val="0"/>
-          <w:numId w:val="3"/>
-        </w:numPr>
-      </w:pPr>
-      <w:r>
-        <w:t xml:space="preserve">a foundation for applying concepts from linear regression theory </w:t>
-      </w:r>
-    </w:p>
-    <w:p>
-      <w:r>
-        <w:t>However, I will explicitly evaluate its limitations, including:</w:t>
-      </w:r>
-    </w:p>
-    <w:p>
-      <w:pPr>
-        <w:numPr>
-          <w:ilvl w:val="0"/>
-          <w:numId w:val="4"/>
-        </w:numPr>
-      </w:pPr>
-      <w:r>
-        <w:lastRenderedPageBreak/>
-        <w:t xml:space="preserve">heteroskedasticity </w:t>
-      </w:r>
-    </w:p>
-    <w:p>
-      <w:pPr>
-        <w:numPr>
-          <w:ilvl w:val="0"/>
-          <w:numId w:val="4"/>
-        </w:numPr>
-      </w:pPr>
-      <w:r>
-        <w:t xml:space="preserve">fitted values outside </w:t>
-      </w:r>
-      <m:oMath>
-        <m:d>
-          <m:dPr>
-            <m:begChr m:val="["/>
-            <m:sepChr m:val=","/>
-            <m:endChr m:val="]"/>
-            <m:ctrlPr>
-              <w:rPr>
-                <w:rFonts w:ascii="Cambria Math" w:hAnsi="Cambria Math"/>
-              </w:rPr>
-            </m:ctrlPr>
-          </m:dPr>
-          <m:e>
-            <m:r>
-              <w:rPr>
-                <w:rFonts w:ascii="Cambria Math" w:hAnsi="Cambria Math"/>
-              </w:rPr>
-              <m:t>0</m:t>
-            </m:r>
-          </m:e>
-          <m:e>
-            <m:r>
-              <w:rPr>
-                <w:rFonts w:ascii="Cambria Math" w:hAnsi="Cambria Math"/>
-              </w:rPr>
-              <m:t>1</m:t>
-            </m:r>
-          </m:e>
-        </m:d>
-      </m:oMath>
-    </w:p>
-    <w:p>
-      <w:pPr>
-        <w:numPr>
-          <w:ilvl w:val="0"/>
-          <w:numId w:val="4"/>
-        </w:numPr>
-      </w:pPr>
-      <w:r>
-        <w:t xml:space="preserve">multicollinearity among predictors </w:t>
-      </w:r>
-    </w:p>
-    <w:p>
-      <w:r>
-        <w:t>These issues will be examined using residual plots, heteroskedasticity diagnostics, and variance inflation factors.</w:t>
-      </w:r>
-    </w:p>
-    <w:p>
-      <w:r>
-        <w:pict w14:anchorId="7D1A0684">
-          <v:rect id="_x0000_i1077" style="width:0;height:1.5pt" o:hralign="center" o:hrstd="t" o:hr="t" fillcolor="#a0a0a0" stroked="f"/>
-        </w:pict>
-      </w:r>
+      </w:pPr>
     </w:p>
     <w:p>
       <w:pPr>
@@ -457,244 +399,191 @@
           <w:b/>
           <w:bCs/>
         </w:rPr>
-        <w:t>Omitted Variable Bias and Confounding</w:t>
-      </w:r>
-    </w:p>
-    <w:p>
-      <w:r>
-        <w:t>To test the central misconception, I will compare nested models:</w:t>
-      </w:r>
-    </w:p>
-    <w:p>
-      <w:pPr>
-        <w:numPr>
-          <w:ilvl w:val="0"/>
-          <w:numId w:val="5"/>
-        </w:numPr>
-      </w:pPr>
-      <w:r>
-        <w:t xml:space="preserve">Model 1: default regressed on credit limit (and possibly income proxies) </w:t>
-      </w:r>
-    </w:p>
-    <w:p>
-      <w:pPr>
-        <w:numPr>
-          <w:ilvl w:val="0"/>
-          <w:numId w:val="5"/>
-        </w:numPr>
-      </w:pPr>
-      <w:r>
-        <w:t xml:space="preserve">Model 2: adding repayment behavior variables (e.g., past payment delays) </w:t>
-      </w:r>
-    </w:p>
-    <w:p>
-      <w:r>
-        <w:t xml:space="preserve">Changes in coefficient estimates will be used to assess </w:t>
-      </w:r>
-      <w:r>
+        <w:t>3.4 Logistic Regression</w:t>
+      </w:r>
+    </w:p>
+    <w:p>
+      <w:r>
+        <w:t>Since the outcome is binary, logistic regression is used as the primary model for inference. This ensures that predicted probabilities are well-defined and allows for more appropriate interpretation of the relationship between predictors and default risk.</w:t>
+      </w:r>
+    </w:p>
+    <w:p>
+      <w:r>
+        <w:t>Results from logistic regression are compared with the linear models to assess whether the main conclusions are consistent across model types.</w:t>
+      </w:r>
+    </w:p>
+    <w:p>
+      <w:pPr>
         <w:rPr>
           <w:b/>
           <w:bCs/>
         </w:rPr>
-        <w:t>omitted variable bias</w:t>
-      </w:r>
-      <w:r>
-        <w:t>. In particular, I will evaluate whether the apparent effect of financial indicators weakens after controlling for repayment behavior.</w:t>
-      </w:r>
-    </w:p>
-    <w:p>
-      <w:r>
-        <w:t xml:space="preserve">As a supporting tool, I may apply the </w:t>
-      </w:r>
-      <w:r>
+      </w:pPr>
+    </w:p>
+    <w:p>
+      <w:pPr>
         <w:rPr>
           <w:b/>
           <w:bCs/>
         </w:rPr>
-        <w:t>Frisch–Waugh–Lovell theorem</w:t>
-      </w:r>
-      <w:r>
-        <w:t xml:space="preserve"> to isolate the partial effect of credit limit after removing the linear influence of behavioral variables. This will clarify whether financial indicators provide independent predictive value.</w:t>
-      </w:r>
-    </w:p>
-    <w:p>
-      <w:r>
-        <w:pict w14:anchorId="6A790284">
-          <v:rect id="_x0000_i1078" style="width:0;height:1.5pt" o:hralign="center" o:hrstd="t" o:hr="t" fillcolor="#a0a0a0" stroked="f"/>
-        </w:pict>
-      </w:r>
-    </w:p>
-    <w:p>
-      <w:pPr>
+      </w:pPr>
+      <w:r>
         <w:rPr>
           <w:b/>
           <w:bCs/>
         </w:rPr>
-      </w:pPr>
-      <w:r>
+        <w:t>3.5 Multicollinearity and Coefficient Stability</w:t>
+      </w:r>
+    </w:p>
+    <w:p>
+      <w:r>
+        <w:t>The dataset contains several groups of variables that are likely to be highly correlated, particularly:</w:t>
+      </w:r>
+    </w:p>
+    <w:p>
+      <w:pPr>
+        <w:numPr>
+          <w:ilvl w:val="0"/>
+          <w:numId w:val="13"/>
+        </w:numPr>
+      </w:pPr>
+      <w:r>
+        <w:t xml:space="preserve">repayment status across multiple months </w:t>
+      </w:r>
+    </w:p>
+    <w:p>
+      <w:pPr>
+        <w:numPr>
+          <w:ilvl w:val="0"/>
+          <w:numId w:val="13"/>
+        </w:numPr>
+      </w:pPr>
+      <w:r>
+        <w:t xml:space="preserve">bill amounts across multiple months </w:t>
+      </w:r>
+    </w:p>
+    <w:p>
+      <w:pPr>
+        <w:numPr>
+          <w:ilvl w:val="0"/>
+          <w:numId w:val="13"/>
+        </w:numPr>
+      </w:pPr>
+      <w:r>
+        <w:t xml:space="preserve">payment amounts across multiple months </w:t>
+      </w:r>
+    </w:p>
+    <w:p>
+      <w:r>
+        <w:t>To assess the impact of this, the analysis includes:</w:t>
+      </w:r>
+    </w:p>
+    <w:p>
+      <w:pPr>
+        <w:numPr>
+          <w:ilvl w:val="0"/>
+          <w:numId w:val="14"/>
+        </w:numPr>
+      </w:pPr>
+      <w:r>
+        <w:t xml:space="preserve">correlation analysis </w:t>
+      </w:r>
+    </w:p>
+    <w:p>
+      <w:pPr>
+        <w:numPr>
+          <w:ilvl w:val="0"/>
+          <w:numId w:val="14"/>
+        </w:numPr>
+      </w:pPr>
+      <w:r>
+        <w:t xml:space="preserve">variance inflation factors (VIF) </w:t>
+      </w:r>
+    </w:p>
+    <w:p>
+      <w:pPr>
+        <w:numPr>
+          <w:ilvl w:val="0"/>
+          <w:numId w:val="14"/>
+        </w:numPr>
+      </w:pPr>
+      <w:r>
+        <w:t xml:space="preserve">comparison of coefficients across different model specifications </w:t>
+      </w:r>
+    </w:p>
+    <w:p>
+      <w:r>
+        <w:t>The goal is to evaluate how sensitive coefficient estimates are to small changes in the model and whether this affects interpretation.</w:t>
+      </w:r>
+    </w:p>
+    <w:p>
+      <w:pPr>
         <w:rPr>
           <w:b/>
           <w:bCs/>
         </w:rPr>
-        <w:t>Model Diagnostics and Specification</w:t>
-      </w:r>
-    </w:p>
-    <w:p>
-      <w:r>
-        <w:t>Model adequacy will be evaluated through:</w:t>
-      </w:r>
-    </w:p>
-    <w:p>
-      <w:pPr>
-        <w:numPr>
-          <w:ilvl w:val="0"/>
-          <w:numId w:val="6"/>
-        </w:numPr>
-      </w:pPr>
-      <w:r>
-        <w:t xml:space="preserve">residual analysis </w:t>
-      </w:r>
-    </w:p>
-    <w:p>
-      <w:pPr>
-        <w:numPr>
-          <w:ilvl w:val="0"/>
-          <w:numId w:val="6"/>
-        </w:numPr>
-      </w:pPr>
-      <w:r>
-        <w:t xml:space="preserve">leverage and influence diagnostics </w:t>
-      </w:r>
-    </w:p>
-    <w:p>
-      <w:pPr>
-        <w:numPr>
-          <w:ilvl w:val="0"/>
-          <w:numId w:val="6"/>
-        </w:numPr>
-      </w:pPr>
-      <w:r>
-        <w:t xml:space="preserve">checks for multicollinearity </w:t>
-      </w:r>
-    </w:p>
-    <w:p>
-      <w:r>
-        <w:t>Based on these diagnostics, I will consider:</w:t>
-      </w:r>
-    </w:p>
-    <w:p>
-      <w:pPr>
-        <w:numPr>
-          <w:ilvl w:val="0"/>
-          <w:numId w:val="7"/>
-        </w:numPr>
-      </w:pPr>
-      <w:r>
-        <w:t xml:space="preserve">transformations of skewed variables </w:t>
-      </w:r>
-    </w:p>
-    <w:p>
-      <w:pPr>
-        <w:numPr>
-          <w:ilvl w:val="0"/>
-          <w:numId w:val="7"/>
-        </w:numPr>
-      </w:pPr>
-      <w:r>
-        <w:t xml:space="preserve">interaction terms (e.g., credit limit × repayment behavior) </w:t>
-      </w:r>
-    </w:p>
-    <w:p>
-      <w:r>
-        <w:t>These extensions allow the model to capture heterogeneous effects and reduce misspecification.</w:t>
-      </w:r>
-    </w:p>
-    <w:p>
-      <w:r>
-        <w:pict w14:anchorId="3F6278DD">
-          <v:rect id="_x0000_i1079" style="width:0;height:1.5pt" o:hralign="center" o:hrstd="t" o:hr="t" fillcolor="#a0a0a0" stroked="f"/>
-        </w:pict>
-      </w:r>
-    </w:p>
-    <w:p>
-      <w:pPr>
+      </w:pPr>
+      <w:r>
         <w:rPr>
           <w:b/>
           <w:bCs/>
         </w:rPr>
-      </w:pPr>
-      <w:r>
+        <w:pict w14:anchorId="78B0A1A8">
+          <v:rect id="_x0000_i1131" style="width:0;height:1.5pt" o:hralign="center" o:hrstd="t" o:hr="t" fillcolor="#a0a0a0" stroked="f"/>
+        </w:pict>
+      </w:r>
+    </w:p>
+    <w:p>
+      <w:pPr>
         <w:rPr>
           <w:b/>
           <w:bCs/>
         </w:rPr>
-        <w:lastRenderedPageBreak/>
-        <w:t>Logistic Regression (Final Model)</w:t>
-      </w:r>
-    </w:p>
-    <w:p>
-      <w:r>
-        <w:t xml:space="preserve">Given the binary outcome, the final model will be a </w:t>
-      </w:r>
+      </w:pPr>
       <w:r>
         <w:rPr>
           <w:b/>
           <w:bCs/>
         </w:rPr>
-        <w:t>logistic regression</w:t>
-      </w:r>
-      <w:r>
-        <w:t>, which addresses the limitations of the LPM.</w:t>
-      </w:r>
-    </w:p>
-    <w:p>
-      <w:r>
-        <w:t>This model will:</w:t>
+        <w:t>3.6 Regularization (Ridge and Lasso)</w:t>
+      </w:r>
+    </w:p>
+    <w:p>
+      <w:r>
+        <w:lastRenderedPageBreak/>
+        <w:t>As a robustness check, regularized logistic regression models (ridge and lasso) are used. These models help address multicollinearity by shrinking or selecting coefficients.</w:t>
+      </w:r>
+    </w:p>
+    <w:p>
+      <w:r>
+        <w:t>The purpose here is not to improve predictive accuracy, but to see whether:</w:t>
       </w:r>
     </w:p>
     <w:p>
       <w:pPr>
         <w:numPr>
           <w:ilvl w:val="0"/>
-          <w:numId w:val="8"/>
+          <w:numId w:val="15"/>
         </w:numPr>
       </w:pPr>
       <w:r>
-        <w:t xml:space="preserve">produce valid probability estimates </w:t>
+        <w:t xml:space="preserve">certain variables remain consistently important </w:t>
       </w:r>
     </w:p>
     <w:p>
       <w:pPr>
         <w:numPr>
           <w:ilvl w:val="0"/>
-          <w:numId w:val="8"/>
+          <w:numId w:val="15"/>
         </w:numPr>
       </w:pPr>
       <w:r>
-        <w:t xml:space="preserve">allow interpretation through odds ratios or marginal effects </w:t>
-      </w:r>
-    </w:p>
-    <w:p>
-      <w:pPr>
-        <w:numPr>
-          <w:ilvl w:val="0"/>
-          <w:numId w:val="8"/>
-        </w:numPr>
-      </w:pPr>
-      <w:r>
-        <w:t xml:space="preserve">serve as the primary model for inference </w:t>
-      </w:r>
-    </w:p>
-    <w:p>
-      <w:r>
-        <w:t>Results from the logistic model will be compared to the LPM to assess whether key conclusions remain consistent across modeling approaches.</w:t>
-      </w:r>
-    </w:p>
-    <w:p>
-      <w:r>
-        <w:pict w14:anchorId="3FC39A3D">
-          <v:rect id="_x0000_i1080" style="width:0;height:1.5pt" o:hralign="center" o:hrstd="t" o:hr="t" fillcolor="#a0a0a0" stroked="f"/>
-        </w:pict>
+        <w:t xml:space="preserve">the model effectively selects one variable among a group of correlated predictors </w:t>
+      </w:r>
+    </w:p>
+    <w:p>
+      <w:r>
+        <w:t>This provides additional insight into how redundancy in the data affects inference.</w:t>
       </w:r>
     </w:p>
     <w:p>
@@ -704,51 +593,185 @@
           <w:bCs/>
         </w:rPr>
       </w:pPr>
-      <w:r>
+    </w:p>
+    <w:p>
+      <w:pPr>
         <w:rPr>
           <w:b/>
           <w:bCs/>
         </w:rPr>
-        <w:t>Additional Work</w:t>
-      </w:r>
-    </w:p>
-    <w:p>
-      <w:r>
-        <w:t>As additional analysis, I may explore:</w:t>
-      </w:r>
-    </w:p>
-    <w:p>
-      <w:pPr>
-        <w:numPr>
-          <w:ilvl w:val="0"/>
-          <w:numId w:val="9"/>
-        </w:numPr>
       </w:pPr>
       <w:r>
         <w:rPr>
           <w:b/>
           <w:bCs/>
         </w:rPr>
-        <w:t>Ridge and Lasso regression</w:t>
-      </w:r>
-      <w:r>
-        <w:t xml:space="preserve"> to address multicollinearity </w:t>
+        <w:t>3.7 Additional Analysis (if needed)</w:t>
+      </w:r>
+    </w:p>
+    <w:p>
+      <w:r>
+        <w:t>Depending on the results, the analysis may include:</w:t>
       </w:r>
     </w:p>
     <w:p>
       <w:pPr>
         <w:numPr>
           <w:ilvl w:val="0"/>
-          <w:numId w:val="9"/>
+          <w:numId w:val="16"/>
         </w:numPr>
       </w:pPr>
       <w:r>
-        <w:t xml:space="preserve">simple cross-validation to evaluate model stability </w:t>
-      </w:r>
-    </w:p>
-    <w:p>
-      <w:r>
-        <w:t>These methods will be used to assess sensitivity of results rather than as the primary focus.</w:t>
+        <w:t xml:space="preserve">interaction terms (e.g., between credit limit and repayment behavior) </w:t>
+      </w:r>
+    </w:p>
+    <w:p>
+      <w:pPr>
+        <w:numPr>
+          <w:ilvl w:val="0"/>
+          <w:numId w:val="16"/>
+        </w:numPr>
+      </w:pPr>
+      <w:r>
+        <w:t xml:space="preserve">simple transformations of skewed variables </w:t>
+      </w:r>
+    </w:p>
+    <w:p>
+      <w:pPr>
+        <w:numPr>
+          <w:ilvl w:val="0"/>
+          <w:numId w:val="16"/>
+        </w:numPr>
+      </w:pPr>
+      <w:r>
+        <w:t xml:space="preserve">comparisons between grouped sets of variables (financial vs behavioral) </w:t>
+      </w:r>
+    </w:p>
+    <w:p>
+      <w:r>
+        <w:t>These will only be included if they add clarity to the interpretation.</w:t>
+      </w:r>
+    </w:p>
+    <w:p>
+      <w:pPr>
+        <w:rPr>
+          <w:b/>
+          <w:bCs/>
+        </w:rPr>
+      </w:pPr>
+    </w:p>
+    <w:p>
+      <w:pPr>
+        <w:rPr>
+          <w:b/>
+          <w:bCs/>
+        </w:rPr>
+      </w:pPr>
+      <w:r>
+        <w:rPr>
+          <w:b/>
+          <w:bCs/>
+        </w:rPr>
+        <w:t>4. Expected Outcomes</w:t>
+      </w:r>
+    </w:p>
+    <w:p>
+      <w:r>
+        <w:t>The expectation is that:</w:t>
+      </w:r>
+    </w:p>
+    <w:p>
+      <w:pPr>
+        <w:numPr>
+          <w:ilvl w:val="0"/>
+          <w:numId w:val="17"/>
+        </w:numPr>
+      </w:pPr>
+      <w:proofErr w:type="gramStart"/>
+      <w:r>
+        <w:t>financial</w:t>
+      </w:r>
+      <w:proofErr w:type="gramEnd"/>
+      <w:r>
+        <w:t xml:space="preserve"> variables may appear important in simpler models </w:t>
+      </w:r>
+    </w:p>
+    <w:p>
+      <w:pPr>
+        <w:numPr>
+          <w:ilvl w:val="0"/>
+          <w:numId w:val="17"/>
+        </w:numPr>
+      </w:pPr>
+      <w:r>
+        <w:t xml:space="preserve">their effects may weaken after </w:t>
+      </w:r>
+      <w:proofErr w:type="gramStart"/>
+      <w:r>
+        <w:t>controlling for</w:t>
+      </w:r>
+      <w:proofErr w:type="gramEnd"/>
+      <w:r>
+        <w:t xml:space="preserve"> repayment behavior </w:t>
+      </w:r>
+    </w:p>
+    <w:p>
+      <w:pPr>
+        <w:numPr>
+          <w:ilvl w:val="0"/>
+          <w:numId w:val="17"/>
+        </w:numPr>
+      </w:pPr>
+      <w:r>
+        <w:t xml:space="preserve">coefficient estimates may vary across specifications due to multicollinearity </w:t>
+      </w:r>
+    </w:p>
+    <w:p>
+      <w:pPr>
+        <w:numPr>
+          <w:ilvl w:val="0"/>
+          <w:numId w:val="17"/>
+        </w:numPr>
+      </w:pPr>
+      <w:r>
+        <w:t xml:space="preserve">regularization may highlight the dominance of behavioral variables </w:t>
+      </w:r>
+    </w:p>
+    <w:p>
+      <w:r>
+        <w:t>Overall, the project aims to show that conclusions about “important” variables are not always stable and depend heavily on model specification.</w:t>
+      </w:r>
+    </w:p>
+    <w:p>
+      <w:pPr>
+        <w:rPr>
+          <w:b/>
+          <w:bCs/>
+        </w:rPr>
+      </w:pPr>
+    </w:p>
+    <w:p>
+      <w:pPr>
+        <w:rPr>
+          <w:b/>
+          <w:bCs/>
+        </w:rPr>
+      </w:pPr>
+      <w:r>
+        <w:rPr>
+          <w:b/>
+          <w:bCs/>
+        </w:rPr>
+        <w:t>5. Feasibility</w:t>
+      </w:r>
+    </w:p>
+    <w:p>
+      <w:r>
+        <w:t xml:space="preserve">The dataset is well-structured and contains no major missing data issues. All proposed methods—linear regression, logistic regression, and regularized models—can be implemented using standard Python libraries. The scope of the project can be adjusted </w:t>
+      </w:r>
+      <w:r>
+        <w:lastRenderedPageBreak/>
+        <w:t>depending on how complex the results become, ensuring that the analysis remains focused and manageable.</w:t>
       </w:r>
     </w:p>
     <w:p/>
@@ -1063,6 +1086,304 @@
     </w:lvl>
   </w:abstractNum>
   <w:abstractNum w:abstractNumId="2" w15:restartNumberingAfterBreak="0">
+    <w:nsid w:val="1CF47B86"/>
+    <w:multiLevelType w:val="multilevel"/>
+    <w:tmpl w:val="313290F0"/>
+    <w:lvl w:ilvl="0">
+      <w:start w:val="1"/>
+      <w:numFmt w:val="bullet"/>
+      <w:lvlText w:val=""/>
+      <w:lvlJc w:val="left"/>
+      <w:pPr>
+        <w:tabs>
+          <w:tab w:val="num" w:pos="720"/>
+        </w:tabs>
+        <w:ind w:left="720" w:hanging="360"/>
+      </w:pPr>
+      <w:rPr>
+        <w:rFonts w:ascii="Symbol" w:hAnsi="Symbol" w:hint="default"/>
+        <w:sz w:val="20"/>
+      </w:rPr>
+    </w:lvl>
+    <w:lvl w:ilvl="1" w:tentative="1">
+      <w:start w:val="1"/>
+      <w:numFmt w:val="bullet"/>
+      <w:lvlText w:val="o"/>
+      <w:lvlJc w:val="left"/>
+      <w:pPr>
+        <w:tabs>
+          <w:tab w:val="num" w:pos="1440"/>
+        </w:tabs>
+        <w:ind w:left="1440" w:hanging="360"/>
+      </w:pPr>
+      <w:rPr>
+        <w:rFonts w:ascii="Courier New" w:hAnsi="Courier New" w:hint="default"/>
+        <w:sz w:val="20"/>
+      </w:rPr>
+    </w:lvl>
+    <w:lvl w:ilvl="2" w:tentative="1">
+      <w:start w:val="1"/>
+      <w:numFmt w:val="bullet"/>
+      <w:lvlText w:val=""/>
+      <w:lvlJc w:val="left"/>
+      <w:pPr>
+        <w:tabs>
+          <w:tab w:val="num" w:pos="2160"/>
+        </w:tabs>
+        <w:ind w:left="2160" w:hanging="360"/>
+      </w:pPr>
+      <w:rPr>
+        <w:rFonts w:ascii="Wingdings" w:hAnsi="Wingdings" w:hint="default"/>
+        <w:sz w:val="20"/>
+      </w:rPr>
+    </w:lvl>
+    <w:lvl w:ilvl="3" w:tentative="1">
+      <w:start w:val="1"/>
+      <w:numFmt w:val="bullet"/>
+      <w:lvlText w:val=""/>
+      <w:lvlJc w:val="left"/>
+      <w:pPr>
+        <w:tabs>
+          <w:tab w:val="num" w:pos="2880"/>
+        </w:tabs>
+        <w:ind w:left="2880" w:hanging="360"/>
+      </w:pPr>
+      <w:rPr>
+        <w:rFonts w:ascii="Wingdings" w:hAnsi="Wingdings" w:hint="default"/>
+        <w:sz w:val="20"/>
+      </w:rPr>
+    </w:lvl>
+    <w:lvl w:ilvl="4" w:tentative="1">
+      <w:start w:val="1"/>
+      <w:numFmt w:val="bullet"/>
+      <w:lvlText w:val=""/>
+      <w:lvlJc w:val="left"/>
+      <w:pPr>
+        <w:tabs>
+          <w:tab w:val="num" w:pos="3600"/>
+        </w:tabs>
+        <w:ind w:left="3600" w:hanging="360"/>
+      </w:pPr>
+      <w:rPr>
+        <w:rFonts w:ascii="Wingdings" w:hAnsi="Wingdings" w:hint="default"/>
+        <w:sz w:val="20"/>
+      </w:rPr>
+    </w:lvl>
+    <w:lvl w:ilvl="5" w:tentative="1">
+      <w:start w:val="1"/>
+      <w:numFmt w:val="bullet"/>
+      <w:lvlText w:val=""/>
+      <w:lvlJc w:val="left"/>
+      <w:pPr>
+        <w:tabs>
+          <w:tab w:val="num" w:pos="4320"/>
+        </w:tabs>
+        <w:ind w:left="4320" w:hanging="360"/>
+      </w:pPr>
+      <w:rPr>
+        <w:rFonts w:ascii="Wingdings" w:hAnsi="Wingdings" w:hint="default"/>
+        <w:sz w:val="20"/>
+      </w:rPr>
+    </w:lvl>
+    <w:lvl w:ilvl="6" w:tentative="1">
+      <w:start w:val="1"/>
+      <w:numFmt w:val="bullet"/>
+      <w:lvlText w:val=""/>
+      <w:lvlJc w:val="left"/>
+      <w:pPr>
+        <w:tabs>
+          <w:tab w:val="num" w:pos="5040"/>
+        </w:tabs>
+        <w:ind w:left="5040" w:hanging="360"/>
+      </w:pPr>
+      <w:rPr>
+        <w:rFonts w:ascii="Wingdings" w:hAnsi="Wingdings" w:hint="default"/>
+        <w:sz w:val="20"/>
+      </w:rPr>
+    </w:lvl>
+    <w:lvl w:ilvl="7" w:tentative="1">
+      <w:start w:val="1"/>
+      <w:numFmt w:val="bullet"/>
+      <w:lvlText w:val=""/>
+      <w:lvlJc w:val="left"/>
+      <w:pPr>
+        <w:tabs>
+          <w:tab w:val="num" w:pos="5760"/>
+        </w:tabs>
+        <w:ind w:left="5760" w:hanging="360"/>
+      </w:pPr>
+      <w:rPr>
+        <w:rFonts w:ascii="Wingdings" w:hAnsi="Wingdings" w:hint="default"/>
+        <w:sz w:val="20"/>
+      </w:rPr>
+    </w:lvl>
+    <w:lvl w:ilvl="8" w:tentative="1">
+      <w:start w:val="1"/>
+      <w:numFmt w:val="bullet"/>
+      <w:lvlText w:val=""/>
+      <w:lvlJc w:val="left"/>
+      <w:pPr>
+        <w:tabs>
+          <w:tab w:val="num" w:pos="6480"/>
+        </w:tabs>
+        <w:ind w:left="6480" w:hanging="360"/>
+      </w:pPr>
+      <w:rPr>
+        <w:rFonts w:ascii="Wingdings" w:hAnsi="Wingdings" w:hint="default"/>
+        <w:sz w:val="20"/>
+      </w:rPr>
+    </w:lvl>
+  </w:abstractNum>
+  <w:abstractNum w:abstractNumId="3" w15:restartNumberingAfterBreak="0">
+    <w:nsid w:val="27174767"/>
+    <w:multiLevelType w:val="multilevel"/>
+    <w:tmpl w:val="D8B2A684"/>
+    <w:lvl w:ilvl="0">
+      <w:start w:val="1"/>
+      <w:numFmt w:val="bullet"/>
+      <w:lvlText w:val=""/>
+      <w:lvlJc w:val="left"/>
+      <w:pPr>
+        <w:tabs>
+          <w:tab w:val="num" w:pos="720"/>
+        </w:tabs>
+        <w:ind w:left="720" w:hanging="360"/>
+      </w:pPr>
+      <w:rPr>
+        <w:rFonts w:ascii="Symbol" w:hAnsi="Symbol" w:hint="default"/>
+        <w:sz w:val="20"/>
+      </w:rPr>
+    </w:lvl>
+    <w:lvl w:ilvl="1" w:tentative="1">
+      <w:start w:val="1"/>
+      <w:numFmt w:val="bullet"/>
+      <w:lvlText w:val="o"/>
+      <w:lvlJc w:val="left"/>
+      <w:pPr>
+        <w:tabs>
+          <w:tab w:val="num" w:pos="1440"/>
+        </w:tabs>
+        <w:ind w:left="1440" w:hanging="360"/>
+      </w:pPr>
+      <w:rPr>
+        <w:rFonts w:ascii="Courier New" w:hAnsi="Courier New" w:hint="default"/>
+        <w:sz w:val="20"/>
+      </w:rPr>
+    </w:lvl>
+    <w:lvl w:ilvl="2" w:tentative="1">
+      <w:start w:val="1"/>
+      <w:numFmt w:val="bullet"/>
+      <w:lvlText w:val=""/>
+      <w:lvlJc w:val="left"/>
+      <w:pPr>
+        <w:tabs>
+          <w:tab w:val="num" w:pos="2160"/>
+        </w:tabs>
+        <w:ind w:left="2160" w:hanging="360"/>
+      </w:pPr>
+      <w:rPr>
+        <w:rFonts w:ascii="Wingdings" w:hAnsi="Wingdings" w:hint="default"/>
+        <w:sz w:val="20"/>
+      </w:rPr>
+    </w:lvl>
+    <w:lvl w:ilvl="3" w:tentative="1">
+      <w:start w:val="1"/>
+      <w:numFmt w:val="bullet"/>
+      <w:lvlText w:val=""/>
+      <w:lvlJc w:val="left"/>
+      <w:pPr>
+        <w:tabs>
+          <w:tab w:val="num" w:pos="2880"/>
+        </w:tabs>
+        <w:ind w:left="2880" w:hanging="360"/>
+      </w:pPr>
+      <w:rPr>
+        <w:rFonts w:ascii="Wingdings" w:hAnsi="Wingdings" w:hint="default"/>
+        <w:sz w:val="20"/>
+      </w:rPr>
+    </w:lvl>
+    <w:lvl w:ilvl="4" w:tentative="1">
+      <w:start w:val="1"/>
+      <w:numFmt w:val="bullet"/>
+      <w:lvlText w:val=""/>
+      <w:lvlJc w:val="left"/>
+      <w:pPr>
+        <w:tabs>
+          <w:tab w:val="num" w:pos="3600"/>
+        </w:tabs>
+        <w:ind w:left="3600" w:hanging="360"/>
+      </w:pPr>
+      <w:rPr>
+        <w:rFonts w:ascii="Wingdings" w:hAnsi="Wingdings" w:hint="default"/>
+        <w:sz w:val="20"/>
+      </w:rPr>
+    </w:lvl>
+    <w:lvl w:ilvl="5" w:tentative="1">
+      <w:start w:val="1"/>
+      <w:numFmt w:val="bullet"/>
+      <w:lvlText w:val=""/>
+      <w:lvlJc w:val="left"/>
+      <w:pPr>
+        <w:tabs>
+          <w:tab w:val="num" w:pos="4320"/>
+        </w:tabs>
+        <w:ind w:left="4320" w:hanging="360"/>
+      </w:pPr>
+      <w:rPr>
+        <w:rFonts w:ascii="Wingdings" w:hAnsi="Wingdings" w:hint="default"/>
+        <w:sz w:val="20"/>
+      </w:rPr>
+    </w:lvl>
+    <w:lvl w:ilvl="6" w:tentative="1">
+      <w:start w:val="1"/>
+      <w:numFmt w:val="bullet"/>
+      <w:lvlText w:val=""/>
+      <w:lvlJc w:val="left"/>
+      <w:pPr>
+        <w:tabs>
+          <w:tab w:val="num" w:pos="5040"/>
+        </w:tabs>
+        <w:ind w:left="5040" w:hanging="360"/>
+      </w:pPr>
+      <w:rPr>
+        <w:rFonts w:ascii="Wingdings" w:hAnsi="Wingdings" w:hint="default"/>
+        <w:sz w:val="20"/>
+      </w:rPr>
+    </w:lvl>
+    <w:lvl w:ilvl="7" w:tentative="1">
+      <w:start w:val="1"/>
+      <w:numFmt w:val="bullet"/>
+      <w:lvlText w:val=""/>
+      <w:lvlJc w:val="left"/>
+      <w:pPr>
+        <w:tabs>
+          <w:tab w:val="num" w:pos="5760"/>
+        </w:tabs>
+        <w:ind w:left="5760" w:hanging="360"/>
+      </w:pPr>
+      <w:rPr>
+        <w:rFonts w:ascii="Wingdings" w:hAnsi="Wingdings" w:hint="default"/>
+        <w:sz w:val="20"/>
+      </w:rPr>
+    </w:lvl>
+    <w:lvl w:ilvl="8" w:tentative="1">
+      <w:start w:val="1"/>
+      <w:numFmt w:val="bullet"/>
+      <w:lvlText w:val=""/>
+      <w:lvlJc w:val="left"/>
+      <w:pPr>
+        <w:tabs>
+          <w:tab w:val="num" w:pos="6480"/>
+        </w:tabs>
+        <w:ind w:left="6480" w:hanging="360"/>
+      </w:pPr>
+      <w:rPr>
+        <w:rFonts w:ascii="Wingdings" w:hAnsi="Wingdings" w:hint="default"/>
+        <w:sz w:val="20"/>
+      </w:rPr>
+    </w:lvl>
+  </w:abstractNum>
+  <w:abstractNum w:abstractNumId="4" w15:restartNumberingAfterBreak="0">
     <w:nsid w:val="34AC6FDE"/>
     <w:multiLevelType w:val="multilevel"/>
     <w:tmpl w:val="D2F24D20"/>
@@ -1211,7 +1532,156 @@
       </w:rPr>
     </w:lvl>
   </w:abstractNum>
-  <w:abstractNum w:abstractNumId="3" w15:restartNumberingAfterBreak="0">
+  <w:abstractNum w:abstractNumId="5" w15:restartNumberingAfterBreak="0">
+    <w:nsid w:val="35F65FF1"/>
+    <w:multiLevelType w:val="multilevel"/>
+    <w:tmpl w:val="E8C8D9DE"/>
+    <w:lvl w:ilvl="0">
+      <w:start w:val="1"/>
+      <w:numFmt w:val="bullet"/>
+      <w:lvlText w:val=""/>
+      <w:lvlJc w:val="left"/>
+      <w:pPr>
+        <w:tabs>
+          <w:tab w:val="num" w:pos="720"/>
+        </w:tabs>
+        <w:ind w:left="720" w:hanging="360"/>
+      </w:pPr>
+      <w:rPr>
+        <w:rFonts w:ascii="Symbol" w:hAnsi="Symbol" w:hint="default"/>
+        <w:sz w:val="20"/>
+      </w:rPr>
+    </w:lvl>
+    <w:lvl w:ilvl="1" w:tentative="1">
+      <w:start w:val="1"/>
+      <w:numFmt w:val="bullet"/>
+      <w:lvlText w:val="o"/>
+      <w:lvlJc w:val="left"/>
+      <w:pPr>
+        <w:tabs>
+          <w:tab w:val="num" w:pos="1440"/>
+        </w:tabs>
+        <w:ind w:left="1440" w:hanging="360"/>
+      </w:pPr>
+      <w:rPr>
+        <w:rFonts w:ascii="Courier New" w:hAnsi="Courier New" w:hint="default"/>
+        <w:sz w:val="20"/>
+      </w:rPr>
+    </w:lvl>
+    <w:lvl w:ilvl="2" w:tentative="1">
+      <w:start w:val="1"/>
+      <w:numFmt w:val="bullet"/>
+      <w:lvlText w:val=""/>
+      <w:lvlJc w:val="left"/>
+      <w:pPr>
+        <w:tabs>
+          <w:tab w:val="num" w:pos="2160"/>
+        </w:tabs>
+        <w:ind w:left="2160" w:hanging="360"/>
+      </w:pPr>
+      <w:rPr>
+        <w:rFonts w:ascii="Wingdings" w:hAnsi="Wingdings" w:hint="default"/>
+        <w:sz w:val="20"/>
+      </w:rPr>
+    </w:lvl>
+    <w:lvl w:ilvl="3" w:tentative="1">
+      <w:start w:val="1"/>
+      <w:numFmt w:val="bullet"/>
+      <w:lvlText w:val=""/>
+      <w:lvlJc w:val="left"/>
+      <w:pPr>
+        <w:tabs>
+          <w:tab w:val="num" w:pos="2880"/>
+        </w:tabs>
+        <w:ind w:left="2880" w:hanging="360"/>
+      </w:pPr>
+      <w:rPr>
+        <w:rFonts w:ascii="Wingdings" w:hAnsi="Wingdings" w:hint="default"/>
+        <w:sz w:val="20"/>
+      </w:rPr>
+    </w:lvl>
+    <w:lvl w:ilvl="4" w:tentative="1">
+      <w:start w:val="1"/>
+      <w:numFmt w:val="bullet"/>
+      <w:lvlText w:val=""/>
+      <w:lvlJc w:val="left"/>
+      <w:pPr>
+        <w:tabs>
+          <w:tab w:val="num" w:pos="3600"/>
+        </w:tabs>
+        <w:ind w:left="3600" w:hanging="360"/>
+      </w:pPr>
+      <w:rPr>
+        <w:rFonts w:ascii="Wingdings" w:hAnsi="Wingdings" w:hint="default"/>
+        <w:sz w:val="20"/>
+      </w:rPr>
+    </w:lvl>
+    <w:lvl w:ilvl="5" w:tentative="1">
+      <w:start w:val="1"/>
+      <w:numFmt w:val="bullet"/>
+      <w:lvlText w:val=""/>
+      <w:lvlJc w:val="left"/>
+      <w:pPr>
+        <w:tabs>
+          <w:tab w:val="num" w:pos="4320"/>
+        </w:tabs>
+        <w:ind w:left="4320" w:hanging="360"/>
+      </w:pPr>
+      <w:rPr>
+        <w:rFonts w:ascii="Wingdings" w:hAnsi="Wingdings" w:hint="default"/>
+        <w:sz w:val="20"/>
+      </w:rPr>
+    </w:lvl>
+    <w:lvl w:ilvl="6" w:tentative="1">
+      <w:start w:val="1"/>
+      <w:numFmt w:val="bullet"/>
+      <w:lvlText w:val=""/>
+      <w:lvlJc w:val="left"/>
+      <w:pPr>
+        <w:tabs>
+          <w:tab w:val="num" w:pos="5040"/>
+        </w:tabs>
+        <w:ind w:left="5040" w:hanging="360"/>
+      </w:pPr>
+      <w:rPr>
+        <w:rFonts w:ascii="Wingdings" w:hAnsi="Wingdings" w:hint="default"/>
+        <w:sz w:val="20"/>
+      </w:rPr>
+    </w:lvl>
+    <w:lvl w:ilvl="7" w:tentative="1">
+      <w:start w:val="1"/>
+      <w:numFmt w:val="bullet"/>
+      <w:lvlText w:val=""/>
+      <w:lvlJc w:val="left"/>
+      <w:pPr>
+        <w:tabs>
+          <w:tab w:val="num" w:pos="5760"/>
+        </w:tabs>
+        <w:ind w:left="5760" w:hanging="360"/>
+      </w:pPr>
+      <w:rPr>
+        <w:rFonts w:ascii="Wingdings" w:hAnsi="Wingdings" w:hint="default"/>
+        <w:sz w:val="20"/>
+      </w:rPr>
+    </w:lvl>
+    <w:lvl w:ilvl="8" w:tentative="1">
+      <w:start w:val="1"/>
+      <w:numFmt w:val="bullet"/>
+      <w:lvlText w:val=""/>
+      <w:lvlJc w:val="left"/>
+      <w:pPr>
+        <w:tabs>
+          <w:tab w:val="num" w:pos="6480"/>
+        </w:tabs>
+        <w:ind w:left="6480" w:hanging="360"/>
+      </w:pPr>
+      <w:rPr>
+        <w:rFonts w:ascii="Wingdings" w:hAnsi="Wingdings" w:hint="default"/>
+        <w:sz w:val="20"/>
+      </w:rPr>
+    </w:lvl>
+  </w:abstractNum>
+  <w:abstractNum w:abstractNumId="6" w15:restartNumberingAfterBreak="0">
     <w:nsid w:val="38583C17"/>
     <w:multiLevelType w:val="multilevel"/>
     <w:tmpl w:val="0366BB84"/>
@@ -1360,7 +1830,7 @@
       </w:rPr>
     </w:lvl>
   </w:abstractNum>
-  <w:abstractNum w:abstractNumId="4" w15:restartNumberingAfterBreak="0">
+  <w:abstractNum w:abstractNumId="7" w15:restartNumberingAfterBreak="0">
     <w:nsid w:val="3D3B3758"/>
     <w:multiLevelType w:val="multilevel"/>
     <w:tmpl w:val="DE10B29C"/>
@@ -1509,7 +1979,7 @@
       </w:rPr>
     </w:lvl>
   </w:abstractNum>
-  <w:abstractNum w:abstractNumId="5" w15:restartNumberingAfterBreak="0">
+  <w:abstractNum w:abstractNumId="8" w15:restartNumberingAfterBreak="0">
     <w:nsid w:val="3F501489"/>
     <w:multiLevelType w:val="multilevel"/>
     <w:tmpl w:val="01AEEC7A"/>
@@ -1658,7 +2128,156 @@
       </w:rPr>
     </w:lvl>
   </w:abstractNum>
-  <w:abstractNum w:abstractNumId="6" w15:restartNumberingAfterBreak="0">
+  <w:abstractNum w:abstractNumId="9" w15:restartNumberingAfterBreak="0">
+    <w:nsid w:val="4C3F5844"/>
+    <w:multiLevelType w:val="multilevel"/>
+    <w:tmpl w:val="FEC091BC"/>
+    <w:lvl w:ilvl="0">
+      <w:start w:val="1"/>
+      <w:numFmt w:val="bullet"/>
+      <w:lvlText w:val=""/>
+      <w:lvlJc w:val="left"/>
+      <w:pPr>
+        <w:tabs>
+          <w:tab w:val="num" w:pos="720"/>
+        </w:tabs>
+        <w:ind w:left="720" w:hanging="360"/>
+      </w:pPr>
+      <w:rPr>
+        <w:rFonts w:ascii="Symbol" w:hAnsi="Symbol" w:hint="default"/>
+        <w:sz w:val="20"/>
+      </w:rPr>
+    </w:lvl>
+    <w:lvl w:ilvl="1" w:tentative="1">
+      <w:start w:val="1"/>
+      <w:numFmt w:val="bullet"/>
+      <w:lvlText w:val="o"/>
+      <w:lvlJc w:val="left"/>
+      <w:pPr>
+        <w:tabs>
+          <w:tab w:val="num" w:pos="1440"/>
+        </w:tabs>
+        <w:ind w:left="1440" w:hanging="360"/>
+      </w:pPr>
+      <w:rPr>
+        <w:rFonts w:ascii="Courier New" w:hAnsi="Courier New" w:hint="default"/>
+        <w:sz w:val="20"/>
+      </w:rPr>
+    </w:lvl>
+    <w:lvl w:ilvl="2" w:tentative="1">
+      <w:start w:val="1"/>
+      <w:numFmt w:val="bullet"/>
+      <w:lvlText w:val=""/>
+      <w:lvlJc w:val="left"/>
+      <w:pPr>
+        <w:tabs>
+          <w:tab w:val="num" w:pos="2160"/>
+        </w:tabs>
+        <w:ind w:left="2160" w:hanging="360"/>
+      </w:pPr>
+      <w:rPr>
+        <w:rFonts w:ascii="Wingdings" w:hAnsi="Wingdings" w:hint="default"/>
+        <w:sz w:val="20"/>
+      </w:rPr>
+    </w:lvl>
+    <w:lvl w:ilvl="3" w:tentative="1">
+      <w:start w:val="1"/>
+      <w:numFmt w:val="bullet"/>
+      <w:lvlText w:val=""/>
+      <w:lvlJc w:val="left"/>
+      <w:pPr>
+        <w:tabs>
+          <w:tab w:val="num" w:pos="2880"/>
+        </w:tabs>
+        <w:ind w:left="2880" w:hanging="360"/>
+      </w:pPr>
+      <w:rPr>
+        <w:rFonts w:ascii="Wingdings" w:hAnsi="Wingdings" w:hint="default"/>
+        <w:sz w:val="20"/>
+      </w:rPr>
+    </w:lvl>
+    <w:lvl w:ilvl="4" w:tentative="1">
+      <w:start w:val="1"/>
+      <w:numFmt w:val="bullet"/>
+      <w:lvlText w:val=""/>
+      <w:lvlJc w:val="left"/>
+      <w:pPr>
+        <w:tabs>
+          <w:tab w:val="num" w:pos="3600"/>
+        </w:tabs>
+        <w:ind w:left="3600" w:hanging="360"/>
+      </w:pPr>
+      <w:rPr>
+        <w:rFonts w:ascii="Wingdings" w:hAnsi="Wingdings" w:hint="default"/>
+        <w:sz w:val="20"/>
+      </w:rPr>
+    </w:lvl>
+    <w:lvl w:ilvl="5" w:tentative="1">
+      <w:start w:val="1"/>
+      <w:numFmt w:val="bullet"/>
+      <w:lvlText w:val=""/>
+      <w:lvlJc w:val="left"/>
+      <w:pPr>
+        <w:tabs>
+          <w:tab w:val="num" w:pos="4320"/>
+        </w:tabs>
+        <w:ind w:left="4320" w:hanging="360"/>
+      </w:pPr>
+      <w:rPr>
+        <w:rFonts w:ascii="Wingdings" w:hAnsi="Wingdings" w:hint="default"/>
+        <w:sz w:val="20"/>
+      </w:rPr>
+    </w:lvl>
+    <w:lvl w:ilvl="6" w:tentative="1">
+      <w:start w:val="1"/>
+      <w:numFmt w:val="bullet"/>
+      <w:lvlText w:val=""/>
+      <w:lvlJc w:val="left"/>
+      <w:pPr>
+        <w:tabs>
+          <w:tab w:val="num" w:pos="5040"/>
+        </w:tabs>
+        <w:ind w:left="5040" w:hanging="360"/>
+      </w:pPr>
+      <w:rPr>
+        <w:rFonts w:ascii="Wingdings" w:hAnsi="Wingdings" w:hint="default"/>
+        <w:sz w:val="20"/>
+      </w:rPr>
+    </w:lvl>
+    <w:lvl w:ilvl="7" w:tentative="1">
+      <w:start w:val="1"/>
+      <w:numFmt w:val="bullet"/>
+      <w:lvlText w:val=""/>
+      <w:lvlJc w:val="left"/>
+      <w:pPr>
+        <w:tabs>
+          <w:tab w:val="num" w:pos="5760"/>
+        </w:tabs>
+        <w:ind w:left="5760" w:hanging="360"/>
+      </w:pPr>
+      <w:rPr>
+        <w:rFonts w:ascii="Wingdings" w:hAnsi="Wingdings" w:hint="default"/>
+        <w:sz w:val="20"/>
+      </w:rPr>
+    </w:lvl>
+    <w:lvl w:ilvl="8" w:tentative="1">
+      <w:start w:val="1"/>
+      <w:numFmt w:val="bullet"/>
+      <w:lvlText w:val=""/>
+      <w:lvlJc w:val="left"/>
+      <w:pPr>
+        <w:tabs>
+          <w:tab w:val="num" w:pos="6480"/>
+        </w:tabs>
+        <w:ind w:left="6480" w:hanging="360"/>
+      </w:pPr>
+      <w:rPr>
+        <w:rFonts w:ascii="Wingdings" w:hAnsi="Wingdings" w:hint="default"/>
+        <w:sz w:val="20"/>
+      </w:rPr>
+    </w:lvl>
+  </w:abstractNum>
+  <w:abstractNum w:abstractNumId="10" w15:restartNumberingAfterBreak="0">
     <w:nsid w:val="54F74E7A"/>
     <w:multiLevelType w:val="multilevel"/>
     <w:tmpl w:val="AD1A5988"/>
@@ -1807,7 +2426,305 @@
       </w:rPr>
     </w:lvl>
   </w:abstractNum>
-  <w:abstractNum w:abstractNumId="7" w15:restartNumberingAfterBreak="0">
+  <w:abstractNum w:abstractNumId="11" w15:restartNumberingAfterBreak="0">
+    <w:nsid w:val="5ADD1482"/>
+    <w:multiLevelType w:val="multilevel"/>
+    <w:tmpl w:val="E3E2F918"/>
+    <w:lvl w:ilvl="0">
+      <w:start w:val="1"/>
+      <w:numFmt w:val="bullet"/>
+      <w:lvlText w:val=""/>
+      <w:lvlJc w:val="left"/>
+      <w:pPr>
+        <w:tabs>
+          <w:tab w:val="num" w:pos="720"/>
+        </w:tabs>
+        <w:ind w:left="720" w:hanging="360"/>
+      </w:pPr>
+      <w:rPr>
+        <w:rFonts w:ascii="Symbol" w:hAnsi="Symbol" w:hint="default"/>
+        <w:sz w:val="20"/>
+      </w:rPr>
+    </w:lvl>
+    <w:lvl w:ilvl="1" w:tentative="1">
+      <w:start w:val="1"/>
+      <w:numFmt w:val="bullet"/>
+      <w:lvlText w:val="o"/>
+      <w:lvlJc w:val="left"/>
+      <w:pPr>
+        <w:tabs>
+          <w:tab w:val="num" w:pos="1440"/>
+        </w:tabs>
+        <w:ind w:left="1440" w:hanging="360"/>
+      </w:pPr>
+      <w:rPr>
+        <w:rFonts w:ascii="Courier New" w:hAnsi="Courier New" w:hint="default"/>
+        <w:sz w:val="20"/>
+      </w:rPr>
+    </w:lvl>
+    <w:lvl w:ilvl="2" w:tentative="1">
+      <w:start w:val="1"/>
+      <w:numFmt w:val="bullet"/>
+      <w:lvlText w:val=""/>
+      <w:lvlJc w:val="left"/>
+      <w:pPr>
+        <w:tabs>
+          <w:tab w:val="num" w:pos="2160"/>
+        </w:tabs>
+        <w:ind w:left="2160" w:hanging="360"/>
+      </w:pPr>
+      <w:rPr>
+        <w:rFonts w:ascii="Wingdings" w:hAnsi="Wingdings" w:hint="default"/>
+        <w:sz w:val="20"/>
+      </w:rPr>
+    </w:lvl>
+    <w:lvl w:ilvl="3" w:tentative="1">
+      <w:start w:val="1"/>
+      <w:numFmt w:val="bullet"/>
+      <w:lvlText w:val=""/>
+      <w:lvlJc w:val="left"/>
+      <w:pPr>
+        <w:tabs>
+          <w:tab w:val="num" w:pos="2880"/>
+        </w:tabs>
+        <w:ind w:left="2880" w:hanging="360"/>
+      </w:pPr>
+      <w:rPr>
+        <w:rFonts w:ascii="Wingdings" w:hAnsi="Wingdings" w:hint="default"/>
+        <w:sz w:val="20"/>
+      </w:rPr>
+    </w:lvl>
+    <w:lvl w:ilvl="4" w:tentative="1">
+      <w:start w:val="1"/>
+      <w:numFmt w:val="bullet"/>
+      <w:lvlText w:val=""/>
+      <w:lvlJc w:val="left"/>
+      <w:pPr>
+        <w:tabs>
+          <w:tab w:val="num" w:pos="3600"/>
+        </w:tabs>
+        <w:ind w:left="3600" w:hanging="360"/>
+      </w:pPr>
+      <w:rPr>
+        <w:rFonts w:ascii="Wingdings" w:hAnsi="Wingdings" w:hint="default"/>
+        <w:sz w:val="20"/>
+      </w:rPr>
+    </w:lvl>
+    <w:lvl w:ilvl="5" w:tentative="1">
+      <w:start w:val="1"/>
+      <w:numFmt w:val="bullet"/>
+      <w:lvlText w:val=""/>
+      <w:lvlJc w:val="left"/>
+      <w:pPr>
+        <w:tabs>
+          <w:tab w:val="num" w:pos="4320"/>
+        </w:tabs>
+        <w:ind w:left="4320" w:hanging="360"/>
+      </w:pPr>
+      <w:rPr>
+        <w:rFonts w:ascii="Wingdings" w:hAnsi="Wingdings" w:hint="default"/>
+        <w:sz w:val="20"/>
+      </w:rPr>
+    </w:lvl>
+    <w:lvl w:ilvl="6" w:tentative="1">
+      <w:start w:val="1"/>
+      <w:numFmt w:val="bullet"/>
+      <w:lvlText w:val=""/>
+      <w:lvlJc w:val="left"/>
+      <w:pPr>
+        <w:tabs>
+          <w:tab w:val="num" w:pos="5040"/>
+        </w:tabs>
+        <w:ind w:left="5040" w:hanging="360"/>
+      </w:pPr>
+      <w:rPr>
+        <w:rFonts w:ascii="Wingdings" w:hAnsi="Wingdings" w:hint="default"/>
+        <w:sz w:val="20"/>
+      </w:rPr>
+    </w:lvl>
+    <w:lvl w:ilvl="7" w:tentative="1">
+      <w:start w:val="1"/>
+      <w:numFmt w:val="bullet"/>
+      <w:lvlText w:val=""/>
+      <w:lvlJc w:val="left"/>
+      <w:pPr>
+        <w:tabs>
+          <w:tab w:val="num" w:pos="5760"/>
+        </w:tabs>
+        <w:ind w:left="5760" w:hanging="360"/>
+      </w:pPr>
+      <w:rPr>
+        <w:rFonts w:ascii="Wingdings" w:hAnsi="Wingdings" w:hint="default"/>
+        <w:sz w:val="20"/>
+      </w:rPr>
+    </w:lvl>
+    <w:lvl w:ilvl="8" w:tentative="1">
+      <w:start w:val="1"/>
+      <w:numFmt w:val="bullet"/>
+      <w:lvlText w:val=""/>
+      <w:lvlJc w:val="left"/>
+      <w:pPr>
+        <w:tabs>
+          <w:tab w:val="num" w:pos="6480"/>
+        </w:tabs>
+        <w:ind w:left="6480" w:hanging="360"/>
+      </w:pPr>
+      <w:rPr>
+        <w:rFonts w:ascii="Wingdings" w:hAnsi="Wingdings" w:hint="default"/>
+        <w:sz w:val="20"/>
+      </w:rPr>
+    </w:lvl>
+  </w:abstractNum>
+  <w:abstractNum w:abstractNumId="12" w15:restartNumberingAfterBreak="0">
+    <w:nsid w:val="5D66503D"/>
+    <w:multiLevelType w:val="multilevel"/>
+    <w:tmpl w:val="EF08C7D2"/>
+    <w:lvl w:ilvl="0">
+      <w:start w:val="1"/>
+      <w:numFmt w:val="bullet"/>
+      <w:lvlText w:val=""/>
+      <w:lvlJc w:val="left"/>
+      <w:pPr>
+        <w:tabs>
+          <w:tab w:val="num" w:pos="720"/>
+        </w:tabs>
+        <w:ind w:left="720" w:hanging="360"/>
+      </w:pPr>
+      <w:rPr>
+        <w:rFonts w:ascii="Symbol" w:hAnsi="Symbol" w:hint="default"/>
+        <w:sz w:val="20"/>
+      </w:rPr>
+    </w:lvl>
+    <w:lvl w:ilvl="1" w:tentative="1">
+      <w:start w:val="1"/>
+      <w:numFmt w:val="bullet"/>
+      <w:lvlText w:val="o"/>
+      <w:lvlJc w:val="left"/>
+      <w:pPr>
+        <w:tabs>
+          <w:tab w:val="num" w:pos="1440"/>
+        </w:tabs>
+        <w:ind w:left="1440" w:hanging="360"/>
+      </w:pPr>
+      <w:rPr>
+        <w:rFonts w:ascii="Courier New" w:hAnsi="Courier New" w:hint="default"/>
+        <w:sz w:val="20"/>
+      </w:rPr>
+    </w:lvl>
+    <w:lvl w:ilvl="2" w:tentative="1">
+      <w:start w:val="1"/>
+      <w:numFmt w:val="bullet"/>
+      <w:lvlText w:val=""/>
+      <w:lvlJc w:val="left"/>
+      <w:pPr>
+        <w:tabs>
+          <w:tab w:val="num" w:pos="2160"/>
+        </w:tabs>
+        <w:ind w:left="2160" w:hanging="360"/>
+      </w:pPr>
+      <w:rPr>
+        <w:rFonts w:ascii="Wingdings" w:hAnsi="Wingdings" w:hint="default"/>
+        <w:sz w:val="20"/>
+      </w:rPr>
+    </w:lvl>
+    <w:lvl w:ilvl="3" w:tentative="1">
+      <w:start w:val="1"/>
+      <w:numFmt w:val="bullet"/>
+      <w:lvlText w:val=""/>
+      <w:lvlJc w:val="left"/>
+      <w:pPr>
+        <w:tabs>
+          <w:tab w:val="num" w:pos="2880"/>
+        </w:tabs>
+        <w:ind w:left="2880" w:hanging="360"/>
+      </w:pPr>
+      <w:rPr>
+        <w:rFonts w:ascii="Wingdings" w:hAnsi="Wingdings" w:hint="default"/>
+        <w:sz w:val="20"/>
+      </w:rPr>
+    </w:lvl>
+    <w:lvl w:ilvl="4" w:tentative="1">
+      <w:start w:val="1"/>
+      <w:numFmt w:val="bullet"/>
+      <w:lvlText w:val=""/>
+      <w:lvlJc w:val="left"/>
+      <w:pPr>
+        <w:tabs>
+          <w:tab w:val="num" w:pos="3600"/>
+        </w:tabs>
+        <w:ind w:left="3600" w:hanging="360"/>
+      </w:pPr>
+      <w:rPr>
+        <w:rFonts w:ascii="Wingdings" w:hAnsi="Wingdings" w:hint="default"/>
+        <w:sz w:val="20"/>
+      </w:rPr>
+    </w:lvl>
+    <w:lvl w:ilvl="5" w:tentative="1">
+      <w:start w:val="1"/>
+      <w:numFmt w:val="bullet"/>
+      <w:lvlText w:val=""/>
+      <w:lvlJc w:val="left"/>
+      <w:pPr>
+        <w:tabs>
+          <w:tab w:val="num" w:pos="4320"/>
+        </w:tabs>
+        <w:ind w:left="4320" w:hanging="360"/>
+      </w:pPr>
+      <w:rPr>
+        <w:rFonts w:ascii="Wingdings" w:hAnsi="Wingdings" w:hint="default"/>
+        <w:sz w:val="20"/>
+      </w:rPr>
+    </w:lvl>
+    <w:lvl w:ilvl="6" w:tentative="1">
+      <w:start w:val="1"/>
+      <w:numFmt w:val="bullet"/>
+      <w:lvlText w:val=""/>
+      <w:lvlJc w:val="left"/>
+      <w:pPr>
+        <w:tabs>
+          <w:tab w:val="num" w:pos="5040"/>
+        </w:tabs>
+        <w:ind w:left="5040" w:hanging="360"/>
+      </w:pPr>
+      <w:rPr>
+        <w:rFonts w:ascii="Wingdings" w:hAnsi="Wingdings" w:hint="default"/>
+        <w:sz w:val="20"/>
+      </w:rPr>
+    </w:lvl>
+    <w:lvl w:ilvl="7" w:tentative="1">
+      <w:start w:val="1"/>
+      <w:numFmt w:val="bullet"/>
+      <w:lvlText w:val=""/>
+      <w:lvlJc w:val="left"/>
+      <w:pPr>
+        <w:tabs>
+          <w:tab w:val="num" w:pos="5760"/>
+        </w:tabs>
+        <w:ind w:left="5760" w:hanging="360"/>
+      </w:pPr>
+      <w:rPr>
+        <w:rFonts w:ascii="Wingdings" w:hAnsi="Wingdings" w:hint="default"/>
+        <w:sz w:val="20"/>
+      </w:rPr>
+    </w:lvl>
+    <w:lvl w:ilvl="8" w:tentative="1">
+      <w:start w:val="1"/>
+      <w:numFmt w:val="bullet"/>
+      <w:lvlText w:val=""/>
+      <w:lvlJc w:val="left"/>
+      <w:pPr>
+        <w:tabs>
+          <w:tab w:val="num" w:pos="6480"/>
+        </w:tabs>
+        <w:ind w:left="6480" w:hanging="360"/>
+      </w:pPr>
+      <w:rPr>
+        <w:rFonts w:ascii="Wingdings" w:hAnsi="Wingdings" w:hint="default"/>
+        <w:sz w:val="20"/>
+      </w:rPr>
+    </w:lvl>
+  </w:abstractNum>
+  <w:abstractNum w:abstractNumId="13" w15:restartNumberingAfterBreak="0">
     <w:nsid w:val="5ED42634"/>
     <w:multiLevelType w:val="multilevel"/>
     <w:tmpl w:val="83A0FEDC"/>
@@ -1956,10 +2873,308 @@
       </w:rPr>
     </w:lvl>
   </w:abstractNum>
-  <w:abstractNum w:abstractNumId="8" w15:restartNumberingAfterBreak="0">
+  <w:abstractNum w:abstractNumId="14" w15:restartNumberingAfterBreak="0">
+    <w:nsid w:val="62E06486"/>
+    <w:multiLevelType w:val="multilevel"/>
+    <w:tmpl w:val="4F8AE980"/>
+    <w:lvl w:ilvl="0">
+      <w:start w:val="1"/>
+      <w:numFmt w:val="bullet"/>
+      <w:lvlText w:val=""/>
+      <w:lvlJc w:val="left"/>
+      <w:pPr>
+        <w:tabs>
+          <w:tab w:val="num" w:pos="720"/>
+        </w:tabs>
+        <w:ind w:left="720" w:hanging="360"/>
+      </w:pPr>
+      <w:rPr>
+        <w:rFonts w:ascii="Symbol" w:hAnsi="Symbol" w:hint="default"/>
+        <w:sz w:val="20"/>
+      </w:rPr>
+    </w:lvl>
+    <w:lvl w:ilvl="1" w:tentative="1">
+      <w:start w:val="1"/>
+      <w:numFmt w:val="bullet"/>
+      <w:lvlText w:val="o"/>
+      <w:lvlJc w:val="left"/>
+      <w:pPr>
+        <w:tabs>
+          <w:tab w:val="num" w:pos="1440"/>
+        </w:tabs>
+        <w:ind w:left="1440" w:hanging="360"/>
+      </w:pPr>
+      <w:rPr>
+        <w:rFonts w:ascii="Courier New" w:hAnsi="Courier New" w:hint="default"/>
+        <w:sz w:val="20"/>
+      </w:rPr>
+    </w:lvl>
+    <w:lvl w:ilvl="2" w:tentative="1">
+      <w:start w:val="1"/>
+      <w:numFmt w:val="bullet"/>
+      <w:lvlText w:val=""/>
+      <w:lvlJc w:val="left"/>
+      <w:pPr>
+        <w:tabs>
+          <w:tab w:val="num" w:pos="2160"/>
+        </w:tabs>
+        <w:ind w:left="2160" w:hanging="360"/>
+      </w:pPr>
+      <w:rPr>
+        <w:rFonts w:ascii="Wingdings" w:hAnsi="Wingdings" w:hint="default"/>
+        <w:sz w:val="20"/>
+      </w:rPr>
+    </w:lvl>
+    <w:lvl w:ilvl="3" w:tentative="1">
+      <w:start w:val="1"/>
+      <w:numFmt w:val="bullet"/>
+      <w:lvlText w:val=""/>
+      <w:lvlJc w:val="left"/>
+      <w:pPr>
+        <w:tabs>
+          <w:tab w:val="num" w:pos="2880"/>
+        </w:tabs>
+        <w:ind w:left="2880" w:hanging="360"/>
+      </w:pPr>
+      <w:rPr>
+        <w:rFonts w:ascii="Wingdings" w:hAnsi="Wingdings" w:hint="default"/>
+        <w:sz w:val="20"/>
+      </w:rPr>
+    </w:lvl>
+    <w:lvl w:ilvl="4" w:tentative="1">
+      <w:start w:val="1"/>
+      <w:numFmt w:val="bullet"/>
+      <w:lvlText w:val=""/>
+      <w:lvlJc w:val="left"/>
+      <w:pPr>
+        <w:tabs>
+          <w:tab w:val="num" w:pos="3600"/>
+        </w:tabs>
+        <w:ind w:left="3600" w:hanging="360"/>
+      </w:pPr>
+      <w:rPr>
+        <w:rFonts w:ascii="Wingdings" w:hAnsi="Wingdings" w:hint="default"/>
+        <w:sz w:val="20"/>
+      </w:rPr>
+    </w:lvl>
+    <w:lvl w:ilvl="5" w:tentative="1">
+      <w:start w:val="1"/>
+      <w:numFmt w:val="bullet"/>
+      <w:lvlText w:val=""/>
+      <w:lvlJc w:val="left"/>
+      <w:pPr>
+        <w:tabs>
+          <w:tab w:val="num" w:pos="4320"/>
+        </w:tabs>
+        <w:ind w:left="4320" w:hanging="360"/>
+      </w:pPr>
+      <w:rPr>
+        <w:rFonts w:ascii="Wingdings" w:hAnsi="Wingdings" w:hint="default"/>
+        <w:sz w:val="20"/>
+      </w:rPr>
+    </w:lvl>
+    <w:lvl w:ilvl="6" w:tentative="1">
+      <w:start w:val="1"/>
+      <w:numFmt w:val="bullet"/>
+      <w:lvlText w:val=""/>
+      <w:lvlJc w:val="left"/>
+      <w:pPr>
+        <w:tabs>
+          <w:tab w:val="num" w:pos="5040"/>
+        </w:tabs>
+        <w:ind w:left="5040" w:hanging="360"/>
+      </w:pPr>
+      <w:rPr>
+        <w:rFonts w:ascii="Wingdings" w:hAnsi="Wingdings" w:hint="default"/>
+        <w:sz w:val="20"/>
+      </w:rPr>
+    </w:lvl>
+    <w:lvl w:ilvl="7" w:tentative="1">
+      <w:start w:val="1"/>
+      <w:numFmt w:val="bullet"/>
+      <w:lvlText w:val=""/>
+      <w:lvlJc w:val="left"/>
+      <w:pPr>
+        <w:tabs>
+          <w:tab w:val="num" w:pos="5760"/>
+        </w:tabs>
+        <w:ind w:left="5760" w:hanging="360"/>
+      </w:pPr>
+      <w:rPr>
+        <w:rFonts w:ascii="Wingdings" w:hAnsi="Wingdings" w:hint="default"/>
+        <w:sz w:val="20"/>
+      </w:rPr>
+    </w:lvl>
+    <w:lvl w:ilvl="8" w:tentative="1">
+      <w:start w:val="1"/>
+      <w:numFmt w:val="bullet"/>
+      <w:lvlText w:val=""/>
+      <w:lvlJc w:val="left"/>
+      <w:pPr>
+        <w:tabs>
+          <w:tab w:val="num" w:pos="6480"/>
+        </w:tabs>
+        <w:ind w:left="6480" w:hanging="360"/>
+      </w:pPr>
+      <w:rPr>
+        <w:rFonts w:ascii="Wingdings" w:hAnsi="Wingdings" w:hint="default"/>
+        <w:sz w:val="20"/>
+      </w:rPr>
+    </w:lvl>
+  </w:abstractNum>
+  <w:abstractNum w:abstractNumId="15" w15:restartNumberingAfterBreak="0">
     <w:nsid w:val="678C21FE"/>
     <w:multiLevelType w:val="multilevel"/>
     <w:tmpl w:val="878ED91A"/>
+    <w:lvl w:ilvl="0">
+      <w:start w:val="1"/>
+      <w:numFmt w:val="bullet"/>
+      <w:lvlText w:val=""/>
+      <w:lvlJc w:val="left"/>
+      <w:pPr>
+        <w:tabs>
+          <w:tab w:val="num" w:pos="720"/>
+        </w:tabs>
+        <w:ind w:left="720" w:hanging="360"/>
+      </w:pPr>
+      <w:rPr>
+        <w:rFonts w:ascii="Symbol" w:hAnsi="Symbol" w:hint="default"/>
+        <w:sz w:val="20"/>
+      </w:rPr>
+    </w:lvl>
+    <w:lvl w:ilvl="1" w:tentative="1">
+      <w:start w:val="1"/>
+      <w:numFmt w:val="bullet"/>
+      <w:lvlText w:val="o"/>
+      <w:lvlJc w:val="left"/>
+      <w:pPr>
+        <w:tabs>
+          <w:tab w:val="num" w:pos="1440"/>
+        </w:tabs>
+        <w:ind w:left="1440" w:hanging="360"/>
+      </w:pPr>
+      <w:rPr>
+        <w:rFonts w:ascii="Courier New" w:hAnsi="Courier New" w:hint="default"/>
+        <w:sz w:val="20"/>
+      </w:rPr>
+    </w:lvl>
+    <w:lvl w:ilvl="2" w:tentative="1">
+      <w:start w:val="1"/>
+      <w:numFmt w:val="bullet"/>
+      <w:lvlText w:val=""/>
+      <w:lvlJc w:val="left"/>
+      <w:pPr>
+        <w:tabs>
+          <w:tab w:val="num" w:pos="2160"/>
+        </w:tabs>
+        <w:ind w:left="2160" w:hanging="360"/>
+      </w:pPr>
+      <w:rPr>
+        <w:rFonts w:ascii="Wingdings" w:hAnsi="Wingdings" w:hint="default"/>
+        <w:sz w:val="20"/>
+      </w:rPr>
+    </w:lvl>
+    <w:lvl w:ilvl="3" w:tentative="1">
+      <w:start w:val="1"/>
+      <w:numFmt w:val="bullet"/>
+      <w:lvlText w:val=""/>
+      <w:lvlJc w:val="left"/>
+      <w:pPr>
+        <w:tabs>
+          <w:tab w:val="num" w:pos="2880"/>
+        </w:tabs>
+        <w:ind w:left="2880" w:hanging="360"/>
+      </w:pPr>
+      <w:rPr>
+        <w:rFonts w:ascii="Wingdings" w:hAnsi="Wingdings" w:hint="default"/>
+        <w:sz w:val="20"/>
+      </w:rPr>
+    </w:lvl>
+    <w:lvl w:ilvl="4" w:tentative="1">
+      <w:start w:val="1"/>
+      <w:numFmt w:val="bullet"/>
+      <w:lvlText w:val=""/>
+      <w:lvlJc w:val="left"/>
+      <w:pPr>
+        <w:tabs>
+          <w:tab w:val="num" w:pos="3600"/>
+        </w:tabs>
+        <w:ind w:left="3600" w:hanging="360"/>
+      </w:pPr>
+      <w:rPr>
+        <w:rFonts w:ascii="Wingdings" w:hAnsi="Wingdings" w:hint="default"/>
+        <w:sz w:val="20"/>
+      </w:rPr>
+    </w:lvl>
+    <w:lvl w:ilvl="5" w:tentative="1">
+      <w:start w:val="1"/>
+      <w:numFmt w:val="bullet"/>
+      <w:lvlText w:val=""/>
+      <w:lvlJc w:val="left"/>
+      <w:pPr>
+        <w:tabs>
+          <w:tab w:val="num" w:pos="4320"/>
+        </w:tabs>
+        <w:ind w:left="4320" w:hanging="360"/>
+      </w:pPr>
+      <w:rPr>
+        <w:rFonts w:ascii="Wingdings" w:hAnsi="Wingdings" w:hint="default"/>
+        <w:sz w:val="20"/>
+      </w:rPr>
+    </w:lvl>
+    <w:lvl w:ilvl="6" w:tentative="1">
+      <w:start w:val="1"/>
+      <w:numFmt w:val="bullet"/>
+      <w:lvlText w:val=""/>
+      <w:lvlJc w:val="left"/>
+      <w:pPr>
+        <w:tabs>
+          <w:tab w:val="num" w:pos="5040"/>
+        </w:tabs>
+        <w:ind w:left="5040" w:hanging="360"/>
+      </w:pPr>
+      <w:rPr>
+        <w:rFonts w:ascii="Wingdings" w:hAnsi="Wingdings" w:hint="default"/>
+        <w:sz w:val="20"/>
+      </w:rPr>
+    </w:lvl>
+    <w:lvl w:ilvl="7" w:tentative="1">
+      <w:start w:val="1"/>
+      <w:numFmt w:val="bullet"/>
+      <w:lvlText w:val=""/>
+      <w:lvlJc w:val="left"/>
+      <w:pPr>
+        <w:tabs>
+          <w:tab w:val="num" w:pos="5760"/>
+        </w:tabs>
+        <w:ind w:left="5760" w:hanging="360"/>
+      </w:pPr>
+      <w:rPr>
+        <w:rFonts w:ascii="Wingdings" w:hAnsi="Wingdings" w:hint="default"/>
+        <w:sz w:val="20"/>
+      </w:rPr>
+    </w:lvl>
+    <w:lvl w:ilvl="8" w:tentative="1">
+      <w:start w:val="1"/>
+      <w:numFmt w:val="bullet"/>
+      <w:lvlText w:val=""/>
+      <w:lvlJc w:val="left"/>
+      <w:pPr>
+        <w:tabs>
+          <w:tab w:val="num" w:pos="6480"/>
+        </w:tabs>
+        <w:ind w:left="6480" w:hanging="360"/>
+      </w:pPr>
+      <w:rPr>
+        <w:rFonts w:ascii="Wingdings" w:hAnsi="Wingdings" w:hint="default"/>
+        <w:sz w:val="20"/>
+      </w:rPr>
+    </w:lvl>
+  </w:abstractNum>
+  <w:abstractNum w:abstractNumId="16" w15:restartNumberingAfterBreak="0">
+    <w:nsid w:val="69AC4515"/>
+    <w:multiLevelType w:val="multilevel"/>
+    <w:tmpl w:val="F98AA8CC"/>
     <w:lvl w:ilvl="0">
       <w:start w:val="1"/>
       <w:numFmt w:val="bullet"/>
@@ -2109,28 +3324,52 @@
     <w:abstractNumId w:val="0"/>
   </w:num>
   <w:num w:numId="2" w16cid:durableId="1172641748">
+    <w:abstractNumId w:val="7"/>
+  </w:num>
+  <w:num w:numId="3" w16cid:durableId="1002198112">
+    <w:abstractNumId w:val="15"/>
+  </w:num>
+  <w:num w:numId="4" w16cid:durableId="275718649">
     <w:abstractNumId w:val="4"/>
   </w:num>
-  <w:num w:numId="3" w16cid:durableId="1002198112">
-    <w:abstractNumId w:val="8"/>
-  </w:num>
-  <w:num w:numId="4" w16cid:durableId="275718649">
-    <w:abstractNumId w:val="2"/>
-  </w:num>
   <w:num w:numId="5" w16cid:durableId="1923682826">
-    <w:abstractNumId w:val="7"/>
+    <w:abstractNumId w:val="13"/>
   </w:num>
   <w:num w:numId="6" w16cid:durableId="729613473">
-    <w:abstractNumId w:val="3"/>
+    <w:abstractNumId w:val="6"/>
   </w:num>
   <w:num w:numId="7" w16cid:durableId="339164081">
-    <w:abstractNumId w:val="6"/>
+    <w:abstractNumId w:val="10"/>
   </w:num>
   <w:num w:numId="8" w16cid:durableId="1168784878">
-    <w:abstractNumId w:val="5"/>
+    <w:abstractNumId w:val="8"/>
   </w:num>
   <w:num w:numId="9" w16cid:durableId="125054051">
     <w:abstractNumId w:val="1"/>
+  </w:num>
+  <w:num w:numId="10" w16cid:durableId="1251744116">
+    <w:abstractNumId w:val="11"/>
+  </w:num>
+  <w:num w:numId="11" w16cid:durableId="1527600603">
+    <w:abstractNumId w:val="2"/>
+  </w:num>
+  <w:num w:numId="12" w16cid:durableId="238632972">
+    <w:abstractNumId w:val="16"/>
+  </w:num>
+  <w:num w:numId="13" w16cid:durableId="844174616">
+    <w:abstractNumId w:val="12"/>
+  </w:num>
+  <w:num w:numId="14" w16cid:durableId="1193425104">
+    <w:abstractNumId w:val="14"/>
+  </w:num>
+  <w:num w:numId="15" w16cid:durableId="1626807848">
+    <w:abstractNumId w:val="5"/>
+  </w:num>
+  <w:num w:numId="16" w16cid:durableId="1203787216">
+    <w:abstractNumId w:val="3"/>
+  </w:num>
+  <w:num w:numId="17" w16cid:durableId="900946403">
+    <w:abstractNumId w:val="9"/>
   </w:num>
 </w:numbering>
 </file>

</xml_diff>

<commit_message>
generate more visuals for report
</commit_message>
<xml_diff>
--- a/Tentative Project Proposal.docx
+++ b/Tentative Project Proposal.docx
@@ -365,7 +365,21 @@
           <w:b/>
           <w:bCs/>
         </w:rPr>
-        <w:t>3.4 Identification Strategy</w:t>
+        <w:t xml:space="preserve">3.4 </w:t>
+      </w:r>
+      <w:r>
+        <w:rPr>
+          <w:b/>
+          <w:bCs/>
+        </w:rPr>
+        <w:t xml:space="preserve">Model </w:t>
+      </w:r>
+      <w:r>
+        <w:rPr>
+          <w:b/>
+          <w:bCs/>
+        </w:rPr>
+        <w:t>Identification Strategy</w:t>
       </w:r>
     </w:p>
     <w:p>

</xml_diff>